<commit_message>
docs: update FSM and Part 1 review artifacts
</commit_message>
<xml_diff>
--- a/TaxonomyFramework/docs/framework/working-drafts/XBRL_GL_Next_Taxonomy_Framework_Part_1_General_rules_revised_collaborative-review_2026-07-29.docx
+++ b/TaxonomyFramework/docs/framework/working-drafts/XBRL_GL_Next_Taxonomy_Framework_Part_1_General_rules_revised_collaborative-review_2026-07-29.docx
@@ -194,14 +194,14 @@
         <w:rPr>
           <w:bCs/>
         </w:rPr>
-        <w:t xml:space="preserve"> is its order of occurrence in that module. Its properties are assigned XXnn-01, XXnn-02, and so on, in order of occurrence within the Class. If a Class has 100 or more properties, all property sequence numbers for that Class use the number of digits required by the maximum property number, for example XXnn-001 </w:t>
+        <w:t xml:space="preserve"> is its order of occurrence in that module. Its properties are assigned XXnn-01, XXnn-02, and so on, in order of occurrence within the Class. If a Class has 100 or more properties, all property sequence numbers for that Class use the number of digits required by the maximum property number, for example XXnn-001 through XXnn-100. IDs shall be unique across the integrated semantic model. The BSM id is </w:t>
       </w:r>
       <w:r>
         <w:rPr>
           <w:bCs/>
         </w:rPr>
         <w:lastRenderedPageBreak/>
-        <w:t xml:space="preserve">through XXnn-100. IDs shall be unique across the integrated semantic model. The BSM id is carried unchanged into the LHM; repeated LHM occurrences are distinguished by </w:t>
+        <w:t xml:space="preserve">carried unchanged into the LHM; repeated LHM occurrences are distinguished by </w:t>
       </w:r>
       <w:proofErr w:type="spellStart"/>
       <w:r>
@@ -10727,6 +10727,14 @@
             </w:r>
             <w:r>
               <w:rPr>
+                <w:rStyle w:val="af8"/>
+                <w:noProof/>
+                <w:lang w:val="en-GB"/>
+              </w:rPr>
+              <w:tab/>
+            </w:r>
+            <w:r>
+              <w:rPr>
                 <w:noProof/>
                 <w:webHidden/>
               </w:rPr>
@@ -12626,9 +12634,9 @@
         <w:tblLook w:val="04A0" w:firstRow="1" w:lastRow="0" w:firstColumn="1" w:lastColumn="0" w:noHBand="0" w:noVBand="1"/>
       </w:tblPr>
       <w:tblGrid>
-        <w:gridCol w:w="1893"/>
-        <w:gridCol w:w="2988"/>
-        <w:gridCol w:w="4979"/>
+        <w:gridCol w:w="1869"/>
+        <w:gridCol w:w="2950"/>
+        <w:gridCol w:w="4917"/>
       </w:tblGrid>
       <w:tr>
         <w:trPr>
@@ -17238,7 +17246,15 @@
     </w:p>
     <w:p>
       <w:r>
-        <w:t>Specialisation MUST maintain an active LIFO resolution stack separate from the cache of Classes already resolved. A stack entry identifies the Class QName currently being resolved and its position in the superclass chain. PUSH occurs immediately before resolving that Class's superclasses; POP occurs only after all inherited properties and direct directives have been resolved and the effective property set has been cached.</w:t>
+        <w:t xml:space="preserve">Specialisation MUST maintain an active LIFO resolution stack separate from the cache of Classes already resolved. A stack entry identifies the Class QName currently being resolved and its position in the superclass chain. PUSH occurs immediately before resolving that Class's superclasses; POP occurs only after all inherited </w:t>
+      </w:r>
+      <w:proofErr w:type="gramStart"/>
+      <w:r>
+        <w:t>properties</w:t>
+      </w:r>
+      <w:proofErr w:type="gramEnd"/>
+      <w:r>
+        <w:t xml:space="preserve"> and direct directives have been resolved and the effective property set has been cached.</w:t>
       </w:r>
     </w:p>
     <w:p>
@@ -21982,9 +21998,9 @@
         <w:tblLook w:val="0620" w:firstRow="1" w:lastRow="0" w:firstColumn="0" w:lastColumn="0" w:noHBand="1" w:noVBand="1"/>
       </w:tblPr>
       <w:tblGrid>
-        <w:gridCol w:w="3262"/>
-        <w:gridCol w:w="3264"/>
-        <w:gridCol w:w="3264"/>
+        <w:gridCol w:w="3238"/>
+        <w:gridCol w:w="3239"/>
+        <w:gridCol w:w="3239"/>
       </w:tblGrid>
       <w:tr>
         <w:trPr>
@@ -22801,13 +22817,13 @@
         <w:tblLook w:val="04A0" w:firstRow="1" w:lastRow="0" w:firstColumn="1" w:lastColumn="0" w:noHBand="0" w:noVBand="1"/>
       </w:tblPr>
       <w:tblGrid>
-        <w:gridCol w:w="2013"/>
-        <w:gridCol w:w="992"/>
-        <w:gridCol w:w="2268"/>
-        <w:gridCol w:w="1701"/>
-        <w:gridCol w:w="942"/>
-        <w:gridCol w:w="943"/>
-        <w:gridCol w:w="943"/>
+        <w:gridCol w:w="1994"/>
+        <w:gridCol w:w="984"/>
+        <w:gridCol w:w="2248"/>
+        <w:gridCol w:w="1686"/>
+        <w:gridCol w:w="934"/>
+        <w:gridCol w:w="935"/>
+        <w:gridCol w:w="935"/>
       </w:tblGrid>
       <w:tr>
         <w:trPr>
@@ -25767,12 +25783,12 @@
         <w:tblLook w:val="04A0" w:firstRow="1" w:lastRow="0" w:firstColumn="1" w:lastColumn="0" w:noHBand="0" w:noVBand="1"/>
       </w:tblPr>
       <w:tblGrid>
-        <w:gridCol w:w="2221"/>
-        <w:gridCol w:w="1095"/>
-        <w:gridCol w:w="2504"/>
-        <w:gridCol w:w="1939"/>
-        <w:gridCol w:w="1023"/>
-        <w:gridCol w:w="1020"/>
+        <w:gridCol w:w="2201"/>
+        <w:gridCol w:w="1086"/>
+        <w:gridCol w:w="2482"/>
+        <w:gridCol w:w="1922"/>
+        <w:gridCol w:w="1014"/>
+        <w:gridCol w:w="1011"/>
       </w:tblGrid>
       <w:tr>
         <w:trPr>
@@ -28290,14 +28306,14 @@
         <w:tblLook w:val="04A0" w:firstRow="1" w:lastRow="0" w:firstColumn="1" w:lastColumn="0" w:noHBand="0" w:noVBand="1"/>
       </w:tblPr>
       <w:tblGrid>
-        <w:gridCol w:w="360"/>
-        <w:gridCol w:w="711"/>
-        <w:gridCol w:w="1750"/>
-        <w:gridCol w:w="1461"/>
-        <w:gridCol w:w="1713"/>
-        <w:gridCol w:w="1861"/>
-        <w:gridCol w:w="1112"/>
-        <w:gridCol w:w="1331"/>
+        <w:gridCol w:w="356"/>
+        <w:gridCol w:w="708"/>
+        <w:gridCol w:w="1710"/>
+        <w:gridCol w:w="1412"/>
+        <w:gridCol w:w="1684"/>
+        <w:gridCol w:w="1841"/>
+        <w:gridCol w:w="1102"/>
+        <w:gridCol w:w="1327"/>
       </w:tblGrid>
       <w:tr>
         <w:trPr>
@@ -30155,13 +30171,13 @@
         <w:tblLook w:val="04A0" w:firstRow="1" w:lastRow="0" w:firstColumn="1" w:lastColumn="0" w:noHBand="0" w:noVBand="1"/>
       </w:tblPr>
       <w:tblGrid>
-        <w:gridCol w:w="819"/>
-        <w:gridCol w:w="872"/>
-        <w:gridCol w:w="2011"/>
-        <w:gridCol w:w="1608"/>
-        <w:gridCol w:w="1205"/>
-        <w:gridCol w:w="1608"/>
-        <w:gridCol w:w="1739"/>
+        <w:gridCol w:w="807"/>
+        <w:gridCol w:w="859"/>
+        <w:gridCol w:w="1981"/>
+        <w:gridCol w:w="1584"/>
+        <w:gridCol w:w="1188"/>
+        <w:gridCol w:w="1584"/>
+        <w:gridCol w:w="1713"/>
       </w:tblGrid>
       <w:tr>
         <w:trPr>
@@ -30631,13 +30647,13 @@
         <w:tblLook w:val="04A0" w:firstRow="1" w:lastRow="0" w:firstColumn="1" w:lastColumn="0" w:noHBand="0" w:noVBand="1"/>
       </w:tblPr>
       <w:tblGrid>
-        <w:gridCol w:w="687"/>
-        <w:gridCol w:w="1004"/>
-        <w:gridCol w:w="2011"/>
-        <w:gridCol w:w="1608"/>
-        <w:gridCol w:w="1205"/>
-        <w:gridCol w:w="1608"/>
-        <w:gridCol w:w="1739"/>
+        <w:gridCol w:w="677"/>
+        <w:gridCol w:w="989"/>
+        <w:gridCol w:w="1981"/>
+        <w:gridCol w:w="1584"/>
+        <w:gridCol w:w="1188"/>
+        <w:gridCol w:w="1584"/>
+        <w:gridCol w:w="1713"/>
       </w:tblGrid>
       <w:tr>
         <w:trPr>
@@ -31297,13 +31313,13 @@
         <w:tblLook w:val="04A0" w:firstRow="1" w:lastRow="0" w:firstColumn="1" w:lastColumn="0" w:noHBand="0" w:noVBand="1"/>
       </w:tblPr>
       <w:tblGrid>
-        <w:gridCol w:w="687"/>
-        <w:gridCol w:w="1004"/>
-        <w:gridCol w:w="2011"/>
-        <w:gridCol w:w="1608"/>
-        <w:gridCol w:w="1205"/>
-        <w:gridCol w:w="1608"/>
-        <w:gridCol w:w="1739"/>
+        <w:gridCol w:w="677"/>
+        <w:gridCol w:w="989"/>
+        <w:gridCol w:w="1981"/>
+        <w:gridCol w:w="1584"/>
+        <w:gridCol w:w="1188"/>
+        <w:gridCol w:w="1584"/>
+        <w:gridCol w:w="1713"/>
       </w:tblGrid>
       <w:tr>
         <w:trPr>
@@ -32149,13 +32165,13 @@
         <w:tblLook w:val="04A0" w:firstRow="1" w:lastRow="0" w:firstColumn="1" w:lastColumn="0" w:noHBand="0" w:noVBand="1"/>
       </w:tblPr>
       <w:tblGrid>
-        <w:gridCol w:w="686"/>
-        <w:gridCol w:w="1053"/>
-        <w:gridCol w:w="1960"/>
-        <w:gridCol w:w="1608"/>
-        <w:gridCol w:w="1205"/>
-        <w:gridCol w:w="1608"/>
-        <w:gridCol w:w="1742"/>
+        <w:gridCol w:w="676"/>
+        <w:gridCol w:w="1038"/>
+        <w:gridCol w:w="1931"/>
+        <w:gridCol w:w="1584"/>
+        <w:gridCol w:w="1187"/>
+        <w:gridCol w:w="1584"/>
+        <w:gridCol w:w="1716"/>
       </w:tblGrid>
       <w:tr>
         <w:trPr>
@@ -33199,13 +33215,13 @@
         <w:tblLook w:val="04A0" w:firstRow="1" w:lastRow="0" w:firstColumn="1" w:lastColumn="0" w:noHBand="0" w:noVBand="1"/>
       </w:tblPr>
       <w:tblGrid>
-        <w:gridCol w:w="685"/>
-        <w:gridCol w:w="1004"/>
-        <w:gridCol w:w="2010"/>
-        <w:gridCol w:w="1608"/>
-        <w:gridCol w:w="1205"/>
-        <w:gridCol w:w="1608"/>
-        <w:gridCol w:w="1742"/>
+        <w:gridCol w:w="676"/>
+        <w:gridCol w:w="989"/>
+        <w:gridCol w:w="1980"/>
+        <w:gridCol w:w="1584"/>
+        <w:gridCol w:w="1187"/>
+        <w:gridCol w:w="1584"/>
+        <w:gridCol w:w="1716"/>
       </w:tblGrid>
       <w:tr>
         <w:trPr>
@@ -34498,13 +34514,13 @@
         <w:tblLook w:val="04A0" w:firstRow="1" w:lastRow="0" w:firstColumn="1" w:lastColumn="0" w:noHBand="0" w:noVBand="1"/>
       </w:tblPr>
       <w:tblGrid>
-        <w:gridCol w:w="686"/>
-        <w:gridCol w:w="1004"/>
-        <w:gridCol w:w="2010"/>
-        <w:gridCol w:w="1410"/>
-        <w:gridCol w:w="1406"/>
-        <w:gridCol w:w="1608"/>
-        <w:gridCol w:w="1738"/>
+        <w:gridCol w:w="676"/>
+        <w:gridCol w:w="989"/>
+        <w:gridCol w:w="1980"/>
+        <w:gridCol w:w="1390"/>
+        <w:gridCol w:w="1385"/>
+        <w:gridCol w:w="1584"/>
+        <w:gridCol w:w="1712"/>
       </w:tblGrid>
       <w:tr>
         <w:trPr>
@@ -35952,13 +35968,13 @@
         <w:tblLook w:val="04A0" w:firstRow="1" w:lastRow="0" w:firstColumn="1" w:lastColumn="0" w:noHBand="0" w:noVBand="1"/>
       </w:tblPr>
       <w:tblGrid>
-        <w:gridCol w:w="686"/>
-        <w:gridCol w:w="1004"/>
-        <w:gridCol w:w="2010"/>
-        <w:gridCol w:w="1410"/>
-        <w:gridCol w:w="1406"/>
-        <w:gridCol w:w="1608"/>
-        <w:gridCol w:w="1738"/>
+        <w:gridCol w:w="676"/>
+        <w:gridCol w:w="989"/>
+        <w:gridCol w:w="1980"/>
+        <w:gridCol w:w="1390"/>
+        <w:gridCol w:w="1385"/>
+        <w:gridCol w:w="1584"/>
+        <w:gridCol w:w="1712"/>
       </w:tblGrid>
       <w:tr>
         <w:trPr>
@@ -37567,13 +37583,13 @@
         <w:tblLook w:val="04A0" w:firstRow="1" w:lastRow="0" w:firstColumn="1" w:lastColumn="0" w:noHBand="0" w:noVBand="1"/>
       </w:tblPr>
       <w:tblGrid>
-        <w:gridCol w:w="686"/>
-        <w:gridCol w:w="1004"/>
-        <w:gridCol w:w="2010"/>
-        <w:gridCol w:w="1410"/>
-        <w:gridCol w:w="1406"/>
-        <w:gridCol w:w="1608"/>
-        <w:gridCol w:w="1738"/>
+        <w:gridCol w:w="676"/>
+        <w:gridCol w:w="989"/>
+        <w:gridCol w:w="1980"/>
+        <w:gridCol w:w="1390"/>
+        <w:gridCol w:w="1385"/>
+        <w:gridCol w:w="1584"/>
+        <w:gridCol w:w="1712"/>
       </w:tblGrid>
       <w:tr>
         <w:trPr>
@@ -39377,13 +39393,13 @@
         <w:tblLook w:val="04A0" w:firstRow="1" w:lastRow="0" w:firstColumn="1" w:lastColumn="0" w:noHBand="0" w:noVBand="1"/>
       </w:tblPr>
       <w:tblGrid>
-        <w:gridCol w:w="686"/>
-        <w:gridCol w:w="1004"/>
-        <w:gridCol w:w="2010"/>
-        <w:gridCol w:w="1410"/>
-        <w:gridCol w:w="1406"/>
-        <w:gridCol w:w="1608"/>
-        <w:gridCol w:w="1738"/>
+        <w:gridCol w:w="676"/>
+        <w:gridCol w:w="989"/>
+        <w:gridCol w:w="1980"/>
+        <w:gridCol w:w="1390"/>
+        <w:gridCol w:w="1385"/>
+        <w:gridCol w:w="1584"/>
+        <w:gridCol w:w="1712"/>
       </w:tblGrid>
       <w:tr>
         <w:trPr>
@@ -43024,8 +43040,8 @@
         <w:tblLook w:val="04A0" w:firstRow="1" w:lastRow="0" w:firstColumn="1" w:lastColumn="0" w:noHBand="0" w:noVBand="1"/>
       </w:tblPr>
       <w:tblGrid>
-        <w:gridCol w:w="2093"/>
-        <w:gridCol w:w="7869"/>
+        <w:gridCol w:w="2039"/>
+        <w:gridCol w:w="7677"/>
       </w:tblGrid>
       <w:tr>
         <w:trPr>
@@ -45139,8 +45155,8 @@
         <w:tblLook w:val="04A0" w:firstRow="1" w:lastRow="0" w:firstColumn="1" w:lastColumn="0" w:noHBand="0" w:noVBand="1"/>
       </w:tblPr>
       <w:tblGrid>
-        <w:gridCol w:w="1242"/>
-        <w:gridCol w:w="8720"/>
+        <w:gridCol w:w="1235"/>
+        <w:gridCol w:w="8511"/>
       </w:tblGrid>
       <w:tr>
         <w:tc>
@@ -45515,9 +45531,9 @@
         <w:tblLook w:val="04A0" w:firstRow="1" w:lastRow="0" w:firstColumn="1" w:lastColumn="0" w:noHBand="0" w:noVBand="1"/>
       </w:tblPr>
       <w:tblGrid>
-        <w:gridCol w:w="2093"/>
-        <w:gridCol w:w="2410"/>
-        <w:gridCol w:w="5459"/>
+        <w:gridCol w:w="2047"/>
+        <w:gridCol w:w="2369"/>
+        <w:gridCol w:w="5320"/>
       </w:tblGrid>
       <w:tr>
         <w:tc>

</xml_diff>